<commit_message>
updated views and templates to utilize conditionals for the Assignment model. This allows easier transition between the manager dashboard and user dashboard
</commit_message>
<xml_diff>
--- a/Documentation/Detailed Design - Shadarien Williams.docx
+++ b/Documentation/Detailed Design - Shadarien Williams.docx
@@ -144,15 +144,7 @@
           <w:b/>
           <w:sz w:val="64"/>
         </w:rPr>
-        <w:t>Detailed</w:t>
-      </w:r>
-      <w:r>
-        <w:rPr>
-          <w:rFonts w:ascii="Times New Roman" w:eastAsia="Times New Roman" w:hAnsi="Times New Roman" w:cs="Times New Roman"/>
-          <w:b/>
-          <w:sz w:val="64"/>
-        </w:rPr>
-        <w:t xml:space="preserve"> Design </w:t>
+        <w:t xml:space="preserve">Detailed Design </w:t>
       </w:r>
     </w:p>
     <w:p>
@@ -426,6 +418,14 @@
     </w:p>
     <w:sdt>
       <w:sdtPr>
+        <w:rPr>
+          <w:rFonts w:ascii="Calibri" w:eastAsia="Calibri" w:hAnsi="Calibri" w:cs="Calibri"/>
+          <w:color w:val="000000"/>
+          <w:kern w:val="2"/>
+          <w:sz w:val="22"/>
+          <w:szCs w:val="22"/>
+          <w14:ligatures w14:val="standardContextual"/>
+        </w:rPr>
         <w:id w:val="1053739596"/>
         <w:docPartObj>
           <w:docPartGallery w:val="Table of Contents"/>
@@ -434,15 +434,9 @@
       </w:sdtPr>
       <w:sdtEndPr>
         <w:rPr>
-          <w:rFonts w:ascii="Calibri" w:eastAsia="Calibri" w:hAnsi="Calibri" w:cs="Calibri"/>
           <w:b/>
           <w:bCs/>
           <w:noProof/>
-          <w:color w:val="000000"/>
-          <w:kern w:val="2"/>
-          <w:sz w:val="22"/>
-          <w:szCs w:val="22"/>
-          <w14:ligatures w14:val="standardContextual"/>
         </w:rPr>
       </w:sdtEndPr>
       <w:sdtContent>
@@ -458,13 +452,15 @@
           <w:pPr>
             <w:pStyle w:val="TOC1"/>
             <w:tabs>
-              <w:tab w:val="left" w:pos="440"/>
+              <w:tab w:val="left" w:pos="480"/>
               <w:tab w:val="right" w:leader="dot" w:pos="9452"/>
             </w:tabs>
             <w:rPr>
               <w:rFonts w:asciiTheme="minorHAnsi" w:eastAsiaTheme="minorEastAsia" w:hAnsiTheme="minorHAnsi" w:cstheme="minorBidi"/>
               <w:noProof/>
               <w:color w:val="auto"/>
+              <w:sz w:val="24"/>
+              <w:szCs w:val="24"/>
             </w:rPr>
           </w:pPr>
           <w:r>
@@ -476,7 +472,7 @@
           <w:r>
             <w:fldChar w:fldCharType="separate"/>
           </w:r>
-          <w:hyperlink w:anchor="_Toc179973842" w:history="1">
+          <w:hyperlink w:anchor="_Toc179977629" w:history="1">
             <w:r>
               <w:rPr>
                 <w:rStyle w:val="Hyperlink"/>
@@ -490,6 +486,8 @@
                 <w:rFonts w:asciiTheme="minorHAnsi" w:eastAsiaTheme="minorEastAsia" w:hAnsiTheme="minorHAnsi" w:cstheme="minorBidi"/>
                 <w:noProof/>
                 <w:color w:val="auto"/>
+                <w:sz w:val="24"/>
+                <w:szCs w:val="24"/>
               </w:rPr>
               <w:tab/>
             </w:r>
@@ -519,7 +517,7 @@
                 <w:noProof/>
                 <w:webHidden/>
               </w:rPr>
-              <w:instrText xml:space="preserve"> PAGEREF _Toc179973842 \h </w:instrText>
+              <w:instrText xml:space="preserve"> PAGEREF _Toc179977629 \h </w:instrText>
             </w:r>
             <w:r>
               <w:rPr>
@@ -554,16 +552,18 @@
           <w:pPr>
             <w:pStyle w:val="TOC1"/>
             <w:tabs>
-              <w:tab w:val="left" w:pos="440"/>
+              <w:tab w:val="left" w:pos="480"/>
               <w:tab w:val="right" w:leader="dot" w:pos="9452"/>
             </w:tabs>
             <w:rPr>
               <w:rFonts w:asciiTheme="minorHAnsi" w:eastAsiaTheme="minorEastAsia" w:hAnsiTheme="minorHAnsi" w:cstheme="minorBidi"/>
               <w:noProof/>
               <w:color w:val="auto"/>
+              <w:sz w:val="24"/>
+              <w:szCs w:val="24"/>
             </w:rPr>
           </w:pPr>
-          <w:hyperlink w:anchor="_Toc179973843" w:history="1">
+          <w:hyperlink w:anchor="_Toc179977630" w:history="1">
             <w:r>
               <w:rPr>
                 <w:rStyle w:val="Hyperlink"/>
@@ -577,6 +577,8 @@
                 <w:rFonts w:asciiTheme="minorHAnsi" w:eastAsiaTheme="minorEastAsia" w:hAnsiTheme="minorHAnsi" w:cstheme="minorBidi"/>
                 <w:noProof/>
                 <w:color w:val="auto"/>
+                <w:sz w:val="24"/>
+                <w:szCs w:val="24"/>
               </w:rPr>
               <w:tab/>
             </w:r>
@@ -606,94 +608,7 @@
                 <w:noProof/>
                 <w:webHidden/>
               </w:rPr>
-              <w:instrText xml:space="preserve"> PAGEREF _Toc179973843 \h </w:instrText>
-            </w:r>
-            <w:r>
-              <w:rPr>
-                <w:noProof/>
-                <w:webHidden/>
-              </w:rPr>
-            </w:r>
-            <w:r>
-              <w:rPr>
-                <w:noProof/>
-                <w:webHidden/>
-              </w:rPr>
-              <w:fldChar w:fldCharType="separate"/>
-            </w:r>
-            <w:r>
-              <w:rPr>
-                <w:noProof/>
-                <w:webHidden/>
-              </w:rPr>
-              <w:t>1</w:t>
-            </w:r>
-            <w:r>
-              <w:rPr>
-                <w:noProof/>
-                <w:webHidden/>
-              </w:rPr>
-              <w:fldChar w:fldCharType="end"/>
-            </w:r>
-          </w:hyperlink>
-        </w:p>
-        <w:p>
-          <w:pPr>
-            <w:pStyle w:val="TOC1"/>
-            <w:tabs>
-              <w:tab w:val="left" w:pos="440"/>
-              <w:tab w:val="right" w:leader="dot" w:pos="9452"/>
-            </w:tabs>
-            <w:rPr>
-              <w:rFonts w:asciiTheme="minorHAnsi" w:eastAsiaTheme="minorEastAsia" w:hAnsiTheme="minorHAnsi" w:cstheme="minorBidi"/>
-              <w:noProof/>
-              <w:color w:val="auto"/>
-            </w:rPr>
-          </w:pPr>
-          <w:hyperlink w:anchor="_Toc179973844" w:history="1">
-            <w:r>
-              <w:rPr>
-                <w:rStyle w:val="Hyperlink"/>
-                <w:bCs/>
-                <w:noProof/>
-              </w:rPr>
-              <w:t>3.</w:t>
-            </w:r>
-            <w:r>
-              <w:rPr>
-                <w:rFonts w:asciiTheme="minorHAnsi" w:eastAsiaTheme="minorEastAsia" w:hAnsiTheme="minorHAnsi" w:cstheme="minorBidi"/>
-                <w:noProof/>
-                <w:color w:val="auto"/>
-              </w:rPr>
-              <w:tab/>
-            </w:r>
-            <w:r>
-              <w:rPr>
-                <w:rStyle w:val="Hyperlink"/>
-                <w:noProof/>
-              </w:rPr>
-              <w:t>Detailed Design of Major Components</w:t>
-            </w:r>
-            <w:r>
-              <w:rPr>
-                <w:noProof/>
-                <w:webHidden/>
-              </w:rPr>
-              <w:tab/>
-            </w:r>
-            <w:r>
-              <w:rPr>
-                <w:noProof/>
-                <w:webHidden/>
-              </w:rPr>
-              <w:fldChar w:fldCharType="begin"/>
-            </w:r>
-            <w:r>
-              <w:rPr>
-                <w:noProof/>
-                <w:webHidden/>
-              </w:rPr>
-              <w:instrText xml:space="preserve"> PAGEREF _Toc179973844 \h </w:instrText>
+              <w:instrText xml:space="preserve"> PAGEREF _Toc179977630 \h </w:instrText>
             </w:r>
             <w:r>
               <w:rPr>
@@ -725,6 +640,552 @@
           </w:hyperlink>
         </w:p>
         <w:p>
+          <w:pPr>
+            <w:pStyle w:val="TOC1"/>
+            <w:tabs>
+              <w:tab w:val="left" w:pos="480"/>
+              <w:tab w:val="right" w:leader="dot" w:pos="9452"/>
+            </w:tabs>
+            <w:rPr>
+              <w:rFonts w:asciiTheme="minorHAnsi" w:eastAsiaTheme="minorEastAsia" w:hAnsiTheme="minorHAnsi" w:cstheme="minorBidi"/>
+              <w:noProof/>
+              <w:color w:val="auto"/>
+              <w:sz w:val="24"/>
+              <w:szCs w:val="24"/>
+            </w:rPr>
+          </w:pPr>
+          <w:hyperlink w:anchor="_Toc179977631" w:history="1">
+            <w:r>
+              <w:rPr>
+                <w:rStyle w:val="Hyperlink"/>
+                <w:bCs/>
+                <w:noProof/>
+              </w:rPr>
+              <w:t>3.</w:t>
+            </w:r>
+            <w:r>
+              <w:rPr>
+                <w:rFonts w:asciiTheme="minorHAnsi" w:eastAsiaTheme="minorEastAsia" w:hAnsiTheme="minorHAnsi" w:cstheme="minorBidi"/>
+                <w:noProof/>
+                <w:color w:val="auto"/>
+                <w:sz w:val="24"/>
+                <w:szCs w:val="24"/>
+              </w:rPr>
+              <w:tab/>
+            </w:r>
+            <w:r>
+              <w:rPr>
+                <w:rStyle w:val="Hyperlink"/>
+                <w:noProof/>
+              </w:rPr>
+              <w:t>Detailed Design of Major Components</w:t>
+            </w:r>
+            <w:r>
+              <w:rPr>
+                <w:noProof/>
+                <w:webHidden/>
+              </w:rPr>
+              <w:tab/>
+            </w:r>
+            <w:r>
+              <w:rPr>
+                <w:noProof/>
+                <w:webHidden/>
+              </w:rPr>
+              <w:fldChar w:fldCharType="begin"/>
+            </w:r>
+            <w:r>
+              <w:rPr>
+                <w:noProof/>
+                <w:webHidden/>
+              </w:rPr>
+              <w:instrText xml:space="preserve"> PAGEREF _Toc179977631 \h </w:instrText>
+            </w:r>
+            <w:r>
+              <w:rPr>
+                <w:noProof/>
+                <w:webHidden/>
+              </w:rPr>
+            </w:r>
+            <w:r>
+              <w:rPr>
+                <w:noProof/>
+                <w:webHidden/>
+              </w:rPr>
+              <w:fldChar w:fldCharType="separate"/>
+            </w:r>
+            <w:r>
+              <w:rPr>
+                <w:noProof/>
+                <w:webHidden/>
+              </w:rPr>
+              <w:t>5</w:t>
+            </w:r>
+            <w:r>
+              <w:rPr>
+                <w:noProof/>
+                <w:webHidden/>
+              </w:rPr>
+              <w:fldChar w:fldCharType="end"/>
+            </w:r>
+          </w:hyperlink>
+        </w:p>
+        <w:p>
+          <w:pPr>
+            <w:pStyle w:val="TOC1"/>
+            <w:tabs>
+              <w:tab w:val="left" w:pos="480"/>
+              <w:tab w:val="right" w:leader="dot" w:pos="9452"/>
+            </w:tabs>
+            <w:rPr>
+              <w:rFonts w:asciiTheme="minorHAnsi" w:eastAsiaTheme="minorEastAsia" w:hAnsiTheme="minorHAnsi" w:cstheme="minorBidi"/>
+              <w:noProof/>
+              <w:color w:val="auto"/>
+              <w:sz w:val="24"/>
+              <w:szCs w:val="24"/>
+            </w:rPr>
+          </w:pPr>
+          <w:hyperlink w:anchor="_Toc179977632" w:history="1">
+            <w:r>
+              <w:rPr>
+                <w:rStyle w:val="Hyperlink"/>
+                <w:bCs/>
+                <w:noProof/>
+              </w:rPr>
+              <w:t>4.</w:t>
+            </w:r>
+            <w:r>
+              <w:rPr>
+                <w:rFonts w:asciiTheme="minorHAnsi" w:eastAsiaTheme="minorEastAsia" w:hAnsiTheme="minorHAnsi" w:cstheme="minorBidi"/>
+                <w:noProof/>
+                <w:color w:val="auto"/>
+                <w:sz w:val="24"/>
+                <w:szCs w:val="24"/>
+              </w:rPr>
+              <w:tab/>
+            </w:r>
+            <w:r>
+              <w:rPr>
+                <w:rStyle w:val="Hyperlink"/>
+                <w:noProof/>
+              </w:rPr>
+              <w:t>API Design</w:t>
+            </w:r>
+            <w:r>
+              <w:rPr>
+                <w:noProof/>
+                <w:webHidden/>
+              </w:rPr>
+              <w:tab/>
+            </w:r>
+            <w:r>
+              <w:rPr>
+                <w:noProof/>
+                <w:webHidden/>
+              </w:rPr>
+              <w:fldChar w:fldCharType="begin"/>
+            </w:r>
+            <w:r>
+              <w:rPr>
+                <w:noProof/>
+                <w:webHidden/>
+              </w:rPr>
+              <w:instrText xml:space="preserve"> PAGEREF _Toc179977632 \h </w:instrText>
+            </w:r>
+            <w:r>
+              <w:rPr>
+                <w:noProof/>
+                <w:webHidden/>
+              </w:rPr>
+            </w:r>
+            <w:r>
+              <w:rPr>
+                <w:noProof/>
+                <w:webHidden/>
+              </w:rPr>
+              <w:fldChar w:fldCharType="separate"/>
+            </w:r>
+            <w:r>
+              <w:rPr>
+                <w:noProof/>
+                <w:webHidden/>
+              </w:rPr>
+              <w:t>7</w:t>
+            </w:r>
+            <w:r>
+              <w:rPr>
+                <w:noProof/>
+                <w:webHidden/>
+              </w:rPr>
+              <w:fldChar w:fldCharType="end"/>
+            </w:r>
+          </w:hyperlink>
+        </w:p>
+        <w:p>
+          <w:pPr>
+            <w:pStyle w:val="TOC1"/>
+            <w:tabs>
+              <w:tab w:val="left" w:pos="480"/>
+              <w:tab w:val="right" w:leader="dot" w:pos="9452"/>
+            </w:tabs>
+            <w:rPr>
+              <w:rFonts w:asciiTheme="minorHAnsi" w:eastAsiaTheme="minorEastAsia" w:hAnsiTheme="minorHAnsi" w:cstheme="minorBidi"/>
+              <w:noProof/>
+              <w:color w:val="auto"/>
+              <w:sz w:val="24"/>
+              <w:szCs w:val="24"/>
+            </w:rPr>
+          </w:pPr>
+          <w:hyperlink w:anchor="_Toc179977633" w:history="1">
+            <w:r>
+              <w:rPr>
+                <w:rStyle w:val="Hyperlink"/>
+                <w:bCs/>
+                <w:noProof/>
+              </w:rPr>
+              <w:t>5.</w:t>
+            </w:r>
+            <w:r>
+              <w:rPr>
+                <w:rFonts w:asciiTheme="minorHAnsi" w:eastAsiaTheme="minorEastAsia" w:hAnsiTheme="minorHAnsi" w:cstheme="minorBidi"/>
+                <w:noProof/>
+                <w:color w:val="auto"/>
+                <w:sz w:val="24"/>
+                <w:szCs w:val="24"/>
+              </w:rPr>
+              <w:tab/>
+            </w:r>
+            <w:r>
+              <w:rPr>
+                <w:rStyle w:val="Hyperlink"/>
+                <w:noProof/>
+              </w:rPr>
+              <w:t>User Interface UI design</w:t>
+            </w:r>
+            <w:r>
+              <w:rPr>
+                <w:noProof/>
+                <w:webHidden/>
+              </w:rPr>
+              <w:tab/>
+            </w:r>
+            <w:r>
+              <w:rPr>
+                <w:noProof/>
+                <w:webHidden/>
+              </w:rPr>
+              <w:fldChar w:fldCharType="begin"/>
+            </w:r>
+            <w:r>
+              <w:rPr>
+                <w:noProof/>
+                <w:webHidden/>
+              </w:rPr>
+              <w:instrText xml:space="preserve"> PAGEREF _Toc179977633 \h </w:instrText>
+            </w:r>
+            <w:r>
+              <w:rPr>
+                <w:noProof/>
+                <w:webHidden/>
+              </w:rPr>
+            </w:r>
+            <w:r>
+              <w:rPr>
+                <w:noProof/>
+                <w:webHidden/>
+              </w:rPr>
+              <w:fldChar w:fldCharType="separate"/>
+            </w:r>
+            <w:r>
+              <w:rPr>
+                <w:noProof/>
+                <w:webHidden/>
+              </w:rPr>
+              <w:t>8</w:t>
+            </w:r>
+            <w:r>
+              <w:rPr>
+                <w:noProof/>
+                <w:webHidden/>
+              </w:rPr>
+              <w:fldChar w:fldCharType="end"/>
+            </w:r>
+          </w:hyperlink>
+        </w:p>
+        <w:p>
+          <w:pPr>
+            <w:pStyle w:val="TOC1"/>
+            <w:tabs>
+              <w:tab w:val="left" w:pos="480"/>
+              <w:tab w:val="right" w:leader="dot" w:pos="9452"/>
+            </w:tabs>
+            <w:rPr>
+              <w:rFonts w:asciiTheme="minorHAnsi" w:eastAsiaTheme="minorEastAsia" w:hAnsiTheme="minorHAnsi" w:cstheme="minorBidi"/>
+              <w:noProof/>
+              <w:color w:val="auto"/>
+              <w:sz w:val="24"/>
+              <w:szCs w:val="24"/>
+            </w:rPr>
+          </w:pPr>
+          <w:hyperlink w:anchor="_Toc179977634" w:history="1">
+            <w:r>
+              <w:rPr>
+                <w:rStyle w:val="Hyperlink"/>
+                <w:bCs/>
+                <w:noProof/>
+              </w:rPr>
+              <w:t>6.</w:t>
+            </w:r>
+            <w:r>
+              <w:rPr>
+                <w:rFonts w:asciiTheme="minorHAnsi" w:eastAsiaTheme="minorEastAsia" w:hAnsiTheme="minorHAnsi" w:cstheme="minorBidi"/>
+                <w:noProof/>
+                <w:color w:val="auto"/>
+                <w:sz w:val="24"/>
+                <w:szCs w:val="24"/>
+              </w:rPr>
+              <w:tab/>
+            </w:r>
+            <w:r>
+              <w:rPr>
+                <w:rStyle w:val="Hyperlink"/>
+                <w:noProof/>
+              </w:rPr>
+              <w:t>Security Considerations</w:t>
+            </w:r>
+            <w:r>
+              <w:rPr>
+                <w:noProof/>
+                <w:webHidden/>
+              </w:rPr>
+              <w:tab/>
+            </w:r>
+            <w:r>
+              <w:rPr>
+                <w:noProof/>
+                <w:webHidden/>
+              </w:rPr>
+              <w:fldChar w:fldCharType="begin"/>
+            </w:r>
+            <w:r>
+              <w:rPr>
+                <w:noProof/>
+                <w:webHidden/>
+              </w:rPr>
+              <w:instrText xml:space="preserve"> PAGEREF _Toc179977634 \h </w:instrText>
+            </w:r>
+            <w:r>
+              <w:rPr>
+                <w:noProof/>
+                <w:webHidden/>
+              </w:rPr>
+            </w:r>
+            <w:r>
+              <w:rPr>
+                <w:noProof/>
+                <w:webHidden/>
+              </w:rPr>
+              <w:fldChar w:fldCharType="separate"/>
+            </w:r>
+            <w:r>
+              <w:rPr>
+                <w:noProof/>
+                <w:webHidden/>
+              </w:rPr>
+              <w:t>11</w:t>
+            </w:r>
+            <w:r>
+              <w:rPr>
+                <w:noProof/>
+                <w:webHidden/>
+              </w:rPr>
+              <w:fldChar w:fldCharType="end"/>
+            </w:r>
+          </w:hyperlink>
+        </w:p>
+        <w:p>
+          <w:pPr>
+            <w:pStyle w:val="TOC1"/>
+            <w:tabs>
+              <w:tab w:val="left" w:pos="480"/>
+              <w:tab w:val="right" w:leader="dot" w:pos="9452"/>
+            </w:tabs>
+            <w:rPr>
+              <w:rFonts w:asciiTheme="minorHAnsi" w:eastAsiaTheme="minorEastAsia" w:hAnsiTheme="minorHAnsi" w:cstheme="minorBidi"/>
+              <w:noProof/>
+              <w:color w:val="auto"/>
+              <w:sz w:val="24"/>
+              <w:szCs w:val="24"/>
+            </w:rPr>
+          </w:pPr>
+          <w:hyperlink w:anchor="_Toc179977635" w:history="1">
+            <w:r>
+              <w:rPr>
+                <w:rStyle w:val="Hyperlink"/>
+                <w:bCs/>
+                <w:noProof/>
+              </w:rPr>
+              <w:t>7.</w:t>
+            </w:r>
+            <w:r>
+              <w:rPr>
+                <w:rFonts w:asciiTheme="minorHAnsi" w:eastAsiaTheme="minorEastAsia" w:hAnsiTheme="minorHAnsi" w:cstheme="minorBidi"/>
+                <w:noProof/>
+                <w:color w:val="auto"/>
+                <w:sz w:val="24"/>
+                <w:szCs w:val="24"/>
+              </w:rPr>
+              <w:tab/>
+            </w:r>
+            <w:r>
+              <w:rPr>
+                <w:rStyle w:val="Hyperlink"/>
+                <w:noProof/>
+              </w:rPr>
+              <w:t>Error Handling</w:t>
+            </w:r>
+            <w:r>
+              <w:rPr>
+                <w:noProof/>
+                <w:webHidden/>
+              </w:rPr>
+              <w:tab/>
+            </w:r>
+            <w:r>
+              <w:rPr>
+                <w:noProof/>
+                <w:webHidden/>
+              </w:rPr>
+              <w:fldChar w:fldCharType="begin"/>
+            </w:r>
+            <w:r>
+              <w:rPr>
+                <w:noProof/>
+                <w:webHidden/>
+              </w:rPr>
+              <w:instrText xml:space="preserve"> PAGEREF _Toc179977635 \h </w:instrText>
+            </w:r>
+            <w:r>
+              <w:rPr>
+                <w:noProof/>
+                <w:webHidden/>
+              </w:rPr>
+            </w:r>
+            <w:r>
+              <w:rPr>
+                <w:noProof/>
+                <w:webHidden/>
+              </w:rPr>
+              <w:fldChar w:fldCharType="separate"/>
+            </w:r>
+            <w:r>
+              <w:rPr>
+                <w:noProof/>
+                <w:webHidden/>
+              </w:rPr>
+              <w:t>11</w:t>
+            </w:r>
+            <w:r>
+              <w:rPr>
+                <w:noProof/>
+                <w:webHidden/>
+              </w:rPr>
+              <w:fldChar w:fldCharType="end"/>
+            </w:r>
+          </w:hyperlink>
+        </w:p>
+        <w:p>
+          <w:pPr>
+            <w:pStyle w:val="TOC1"/>
+            <w:tabs>
+              <w:tab w:val="left" w:pos="480"/>
+              <w:tab w:val="right" w:leader="dot" w:pos="9452"/>
+            </w:tabs>
+            <w:rPr>
+              <w:rFonts w:asciiTheme="minorHAnsi" w:eastAsiaTheme="minorEastAsia" w:hAnsiTheme="minorHAnsi" w:cstheme="minorBidi"/>
+              <w:noProof/>
+              <w:color w:val="auto"/>
+              <w:sz w:val="24"/>
+              <w:szCs w:val="24"/>
+            </w:rPr>
+          </w:pPr>
+          <w:hyperlink w:anchor="_Toc179977636" w:history="1">
+            <w:r>
+              <w:rPr>
+                <w:rStyle w:val="Hyperlink"/>
+                <w:bCs/>
+                <w:noProof/>
+              </w:rPr>
+              <w:t>8.</w:t>
+            </w:r>
+            <w:r>
+              <w:rPr>
+                <w:rFonts w:asciiTheme="minorHAnsi" w:eastAsiaTheme="minorEastAsia" w:hAnsiTheme="minorHAnsi" w:cstheme="minorBidi"/>
+                <w:noProof/>
+                <w:color w:val="auto"/>
+                <w:sz w:val="24"/>
+                <w:szCs w:val="24"/>
+              </w:rPr>
+              <w:tab/>
+            </w:r>
+            <w:r>
+              <w:rPr>
+                <w:rStyle w:val="Hyperlink"/>
+                <w:noProof/>
+              </w:rPr>
+              <w:t>Testing Strategy</w:t>
+            </w:r>
+            <w:r>
+              <w:rPr>
+                <w:noProof/>
+                <w:webHidden/>
+              </w:rPr>
+              <w:tab/>
+            </w:r>
+            <w:r>
+              <w:rPr>
+                <w:noProof/>
+                <w:webHidden/>
+              </w:rPr>
+              <w:fldChar w:fldCharType="begin"/>
+            </w:r>
+            <w:r>
+              <w:rPr>
+                <w:noProof/>
+                <w:webHidden/>
+              </w:rPr>
+              <w:instrText xml:space="preserve"> PAGEREF _Toc179977636 \h </w:instrText>
+            </w:r>
+            <w:r>
+              <w:rPr>
+                <w:noProof/>
+                <w:webHidden/>
+              </w:rPr>
+            </w:r>
+            <w:r>
+              <w:rPr>
+                <w:noProof/>
+                <w:webHidden/>
+              </w:rPr>
+              <w:fldChar w:fldCharType="separate"/>
+            </w:r>
+            <w:r>
+              <w:rPr>
+                <w:noProof/>
+                <w:webHidden/>
+              </w:rPr>
+              <w:t>12</w:t>
+            </w:r>
+            <w:r>
+              <w:rPr>
+                <w:noProof/>
+                <w:webHidden/>
+              </w:rPr>
+              <w:fldChar w:fldCharType="end"/>
+            </w:r>
+          </w:hyperlink>
+        </w:p>
+        <w:p>
           <w:r>
             <w:rPr>
               <w:b/>
@@ -753,6 +1214,7 @@
           <w:i/>
           <w:sz w:val="20"/>
         </w:rPr>
+        <w:lastRenderedPageBreak/>
         <w:t xml:space="preserve"> </w:t>
       </w:r>
     </w:p>
@@ -773,7 +1235,7 @@
         <w:pStyle w:val="Heading1"/>
         <w:ind w:left="398" w:hanging="413"/>
       </w:pPr>
-      <w:bookmarkStart w:id="0" w:name="_Toc179973842"/>
+      <w:bookmarkStart w:id="0" w:name="_Toc179977629"/>
       <w:r>
         <w:lastRenderedPageBreak/>
         <w:t>Introduction</w:t>
@@ -926,7 +1388,7 @@
       <w:r>
         <w:t xml:space="preserve"> </w:t>
       </w:r>
-      <w:bookmarkStart w:id="1" w:name="_Toc179973843"/>
+      <w:bookmarkStart w:id="1" w:name="_Toc179977630"/>
       <w:r>
         <w:t>System Architecture Description</w:t>
       </w:r>
@@ -1301,6 +1763,7 @@
       <w:r>
         <w:rPr>
           <w:rFonts w:ascii="Times New Roman" w:eastAsia="Times New Roman" w:hAnsi="Times New Roman" w:cs="Times New Roman"/>
+          <w:noProof/>
           <w:color w:val="auto"/>
           <w:kern w:val="0"/>
           <w:sz w:val="24"/>
@@ -1576,7 +2039,7 @@
       <w:pPr>
         <w:pStyle w:val="Heading1"/>
       </w:pPr>
-      <w:bookmarkStart w:id="2" w:name="_Toc179973844"/>
+      <w:bookmarkStart w:id="2" w:name="_Toc179977631"/>
       <w:r>
         <w:t>Detailed Design of Major Components</w:t>
       </w:r>
@@ -1734,113 +2197,22 @@
                         <w:txbxContent>
                           <w:p>
                             <w:r>
-                              <w:t xml:space="preserve">class </w:t>
-                            </w:r>
-                            <w:proofErr w:type="gramStart"/>
-                            <w:r>
-                              <w:t>User(</w:t>
-                            </w:r>
-                            <w:proofErr w:type="spellStart"/>
-                            <w:proofErr w:type="gramEnd"/>
-                            <w:r>
-                              <w:t>AbstractUser</w:t>
-                            </w:r>
-                            <w:proofErr w:type="spellEnd"/>
-                            <w:r>
-                              <w:t>):</w:t>
+                              <w:t>class User(AbstractUser):</w:t>
                             </w:r>
                           </w:p>
                           <w:p>
                             <w:r>
-                              <w:t xml:space="preserve">    role = </w:t>
-                            </w:r>
-                            <w:proofErr w:type="spellStart"/>
-                            <w:proofErr w:type="gramStart"/>
-                            <w:r>
-                              <w:t>models.CharField</w:t>
-                            </w:r>
-                            <w:proofErr w:type="spellEnd"/>
-                            <w:proofErr w:type="gramEnd"/>
-                            <w:r>
-                              <w:t>(</w:t>
-                            </w:r>
-                            <w:proofErr w:type="spellStart"/>
-                            <w:r>
-                              <w:t>max_length</w:t>
-                            </w:r>
-                            <w:proofErr w:type="spellEnd"/>
-                            <w:r>
-                              <w:t>=20, choices=[('admin', 'Admin'), ('manager', 'Manager'), ('user', 'User')])</w:t>
+                              <w:t xml:space="preserve">    role = models.CharField(max_length=20, choices=[('admin', 'Admin'), ('manager', 'Manager'), ('user', 'User')])</w:t>
                             </w:r>
                           </w:p>
                           <w:p>
                             <w:r>
-                              <w:t xml:space="preserve">    </w:t>
-                            </w:r>
-                            <w:proofErr w:type="spellStart"/>
-                            <w:r>
-                              <w:t>profile_image</w:t>
-                            </w:r>
-                            <w:proofErr w:type="spellEnd"/>
-                            <w:r>
-                              <w:t xml:space="preserve"> = </w:t>
-                            </w:r>
-                            <w:proofErr w:type="spellStart"/>
-                            <w:proofErr w:type="gramStart"/>
-                            <w:r>
-                              <w:t>models.ImageField</w:t>
-                            </w:r>
-                            <w:proofErr w:type="spellEnd"/>
-                            <w:proofErr w:type="gramEnd"/>
-                            <w:r>
-                              <w:t>(</w:t>
-                            </w:r>
-                            <w:proofErr w:type="spellStart"/>
-                            <w:r>
-                              <w:t>upload_to</w:t>
-                            </w:r>
-                            <w:proofErr w:type="spellEnd"/>
-                            <w:r>
-                              <w:t>='</w:t>
-                            </w:r>
-                            <w:proofErr w:type="spellStart"/>
-                            <w:r>
-                              <w:t>profile_images</w:t>
-                            </w:r>
-                            <w:proofErr w:type="spellEnd"/>
-                            <w:r>
-                              <w:t>/', null=True, blank=True)</w:t>
+                              <w:t xml:space="preserve">    profile_image = models.ImageField(upload_to='profile_images/', null=True, blank=True)</w:t>
                             </w:r>
                           </w:p>
                           <w:p>
                             <w:r>
-                              <w:t xml:space="preserve">    </w:t>
-                            </w:r>
-                            <w:proofErr w:type="spellStart"/>
-                            <w:r>
-                              <w:t>contactNumber</w:t>
-                            </w:r>
-                            <w:proofErr w:type="spellEnd"/>
-                            <w:r>
-                              <w:t xml:space="preserve"> = </w:t>
-                            </w:r>
-                            <w:proofErr w:type="spellStart"/>
-                            <w:proofErr w:type="gramStart"/>
-                            <w:r>
-                              <w:t>models.CharField</w:t>
-                            </w:r>
-                            <w:proofErr w:type="spellEnd"/>
-                            <w:proofErr w:type="gramEnd"/>
-                            <w:r>
-                              <w:t>(</w:t>
-                            </w:r>
-                            <w:proofErr w:type="spellStart"/>
-                            <w:r>
-                              <w:t>max_length</w:t>
-                            </w:r>
-                            <w:proofErr w:type="spellEnd"/>
-                            <w:r>
-                              <w:t>=15, null=True, blank=True)</w:t>
+                              <w:t xml:space="preserve">    contactNumber = models.CharField(max_length=15, null=True, blank=True)</w:t>
                             </w:r>
                           </w:p>
                         </w:txbxContent>
@@ -1871,113 +2243,22 @@
                   <w:txbxContent>
                     <w:p>
                       <w:r>
-                        <w:t xml:space="preserve">class </w:t>
-                      </w:r>
-                      <w:proofErr w:type="gramStart"/>
-                      <w:r>
-                        <w:t>User(</w:t>
-                      </w:r>
-                      <w:proofErr w:type="spellStart"/>
-                      <w:proofErr w:type="gramEnd"/>
-                      <w:r>
-                        <w:t>AbstractUser</w:t>
-                      </w:r>
-                      <w:proofErr w:type="spellEnd"/>
-                      <w:r>
-                        <w:t>):</w:t>
+                        <w:t>class User(AbstractUser):</w:t>
                       </w:r>
                     </w:p>
                     <w:p>
                       <w:r>
-                        <w:t xml:space="preserve">    role = </w:t>
-                      </w:r>
-                      <w:proofErr w:type="spellStart"/>
-                      <w:proofErr w:type="gramStart"/>
-                      <w:r>
-                        <w:t>models.CharField</w:t>
-                      </w:r>
-                      <w:proofErr w:type="spellEnd"/>
-                      <w:proofErr w:type="gramEnd"/>
-                      <w:r>
-                        <w:t>(</w:t>
-                      </w:r>
-                      <w:proofErr w:type="spellStart"/>
-                      <w:r>
-                        <w:t>max_length</w:t>
-                      </w:r>
-                      <w:proofErr w:type="spellEnd"/>
-                      <w:r>
-                        <w:t>=20, choices=[('admin', 'Admin'), ('manager', 'Manager'), ('user', 'User')])</w:t>
+                        <w:t xml:space="preserve">    role = models.CharField(max_length=20, choices=[('admin', 'Admin'), ('manager', 'Manager'), ('user', 'User')])</w:t>
                       </w:r>
                     </w:p>
                     <w:p>
                       <w:r>
-                        <w:t xml:space="preserve">    </w:t>
-                      </w:r>
-                      <w:proofErr w:type="spellStart"/>
-                      <w:r>
-                        <w:t>profile_image</w:t>
-                      </w:r>
-                      <w:proofErr w:type="spellEnd"/>
-                      <w:r>
-                        <w:t xml:space="preserve"> = </w:t>
-                      </w:r>
-                      <w:proofErr w:type="spellStart"/>
-                      <w:proofErr w:type="gramStart"/>
-                      <w:r>
-                        <w:t>models.ImageField</w:t>
-                      </w:r>
-                      <w:proofErr w:type="spellEnd"/>
-                      <w:proofErr w:type="gramEnd"/>
-                      <w:r>
-                        <w:t>(</w:t>
-                      </w:r>
-                      <w:proofErr w:type="spellStart"/>
-                      <w:r>
-                        <w:t>upload_to</w:t>
-                      </w:r>
-                      <w:proofErr w:type="spellEnd"/>
-                      <w:r>
-                        <w:t>='</w:t>
-                      </w:r>
-                      <w:proofErr w:type="spellStart"/>
-                      <w:r>
-                        <w:t>profile_images</w:t>
-                      </w:r>
-                      <w:proofErr w:type="spellEnd"/>
-                      <w:r>
-                        <w:t>/', null=True, blank=True)</w:t>
+                        <w:t xml:space="preserve">    profile_image = models.ImageField(upload_to='profile_images/', null=True, blank=True)</w:t>
                       </w:r>
                     </w:p>
                     <w:p>
                       <w:r>
-                        <w:t xml:space="preserve">    </w:t>
-                      </w:r>
-                      <w:proofErr w:type="spellStart"/>
-                      <w:r>
-                        <w:t>contactNumber</w:t>
-                      </w:r>
-                      <w:proofErr w:type="spellEnd"/>
-                      <w:r>
-                        <w:t xml:space="preserve"> = </w:t>
-                      </w:r>
-                      <w:proofErr w:type="spellStart"/>
-                      <w:proofErr w:type="gramStart"/>
-                      <w:r>
-                        <w:t>models.CharField</w:t>
-                      </w:r>
-                      <w:proofErr w:type="spellEnd"/>
-                      <w:proofErr w:type="gramEnd"/>
-                      <w:r>
-                        <w:t>(</w:t>
-                      </w:r>
-                      <w:proofErr w:type="spellStart"/>
-                      <w:r>
-                        <w:t>max_length</w:t>
-                      </w:r>
-                      <w:proofErr w:type="spellEnd"/>
-                      <w:r>
-                        <w:t>=15, null=True, blank=True)</w:t>
+                        <w:t xml:space="preserve">    contactNumber = models.CharField(max_length=15, null=True, blank=True)</w:t>
                       </w:r>
                     </w:p>
                   </w:txbxContent>
@@ -2194,171 +2475,37 @@
                         <w:txbxContent>
                           <w:p>
                             <w:r>
-                              <w:t>class Task(</w:t>
-                            </w:r>
-                            <w:proofErr w:type="spellStart"/>
-                            <w:proofErr w:type="gramStart"/>
-                            <w:r>
-                              <w:t>models.Model</w:t>
-                            </w:r>
-                            <w:proofErr w:type="spellEnd"/>
-                            <w:proofErr w:type="gramEnd"/>
-                            <w:r>
-                              <w:t>):</w:t>
+                              <w:t>class Task(models.Model):</w:t>
                             </w:r>
                           </w:p>
                           <w:p>
                             <w:r>
-                              <w:t xml:space="preserve">    title = </w:t>
-                            </w:r>
-                            <w:proofErr w:type="spellStart"/>
-                            <w:proofErr w:type="gramStart"/>
-                            <w:r>
-                              <w:t>models.CharField</w:t>
-                            </w:r>
-                            <w:proofErr w:type="spellEnd"/>
-                            <w:proofErr w:type="gramEnd"/>
-                            <w:r>
-                              <w:t>(</w:t>
-                            </w:r>
-                            <w:proofErr w:type="spellStart"/>
-                            <w:r>
-                              <w:t>max_length</w:t>
-                            </w:r>
-                            <w:proofErr w:type="spellEnd"/>
-                            <w:r>
-                              <w:t>=250)</w:t>
+                              <w:t xml:space="preserve">    title = models.CharField(max_length=250)</w:t>
                             </w:r>
                           </w:p>
                           <w:p>
                             <w:r>
-                              <w:t xml:space="preserve">    description = </w:t>
-                            </w:r>
-                            <w:proofErr w:type="spellStart"/>
-                            <w:proofErr w:type="gramStart"/>
-                            <w:r>
-                              <w:t>models.TextField</w:t>
-                            </w:r>
-                            <w:proofErr w:type="spellEnd"/>
-                            <w:proofErr w:type="gramEnd"/>
-                            <w:r>
-                              <w:t>()</w:t>
+                              <w:t xml:space="preserve">    description = models.TextField()</w:t>
                             </w:r>
                           </w:p>
                           <w:p>
                             <w:r>
-                              <w:t xml:space="preserve">    </w:t>
-                            </w:r>
-                            <w:proofErr w:type="spellStart"/>
-                            <w:r>
-                              <w:t>due_date</w:t>
-                            </w:r>
-                            <w:proofErr w:type="spellEnd"/>
-                            <w:r>
-                              <w:t xml:space="preserve"> = </w:t>
-                            </w:r>
-                            <w:proofErr w:type="spellStart"/>
-                            <w:proofErr w:type="gramStart"/>
-                            <w:r>
-                              <w:t>models.DateTimeField</w:t>
-                            </w:r>
-                            <w:proofErr w:type="spellEnd"/>
-                            <w:proofErr w:type="gramEnd"/>
-                            <w:r>
-                              <w:t>()</w:t>
+                              <w:t xml:space="preserve">    due_date = models.DateTimeField()</w:t>
                             </w:r>
                           </w:p>
                           <w:p>
                             <w:r>
-                              <w:t xml:space="preserve">    priority = </w:t>
-                            </w:r>
-                            <w:proofErr w:type="spellStart"/>
-                            <w:proofErr w:type="gramStart"/>
-                            <w:r>
-                              <w:t>models.CharField</w:t>
-                            </w:r>
-                            <w:proofErr w:type="spellEnd"/>
-                            <w:proofErr w:type="gramEnd"/>
-                            <w:r>
-                              <w:t>(</w:t>
-                            </w:r>
-                            <w:proofErr w:type="spellStart"/>
-                            <w:r>
-                              <w:t>max_length</w:t>
-                            </w:r>
-                            <w:proofErr w:type="spellEnd"/>
-                            <w:r>
-                              <w:t>=10, choices=[('High', 'High'), ('Medium', 'Medium'), ('Low', 'Low')])</w:t>
+                              <w:t xml:space="preserve">    priority = models.CharField(max_length=10, choices=[('High', 'High'), ('Medium', 'Medium'), ('Low', 'Low')])</w:t>
                             </w:r>
                           </w:p>
                           <w:p>
                             <w:r>
-                              <w:t xml:space="preserve">    status = </w:t>
-                            </w:r>
-                            <w:proofErr w:type="spellStart"/>
-                            <w:proofErr w:type="gramStart"/>
-                            <w:r>
-                              <w:t>models.CharField</w:t>
-                            </w:r>
-                            <w:proofErr w:type="spellEnd"/>
-                            <w:proofErr w:type="gramEnd"/>
-                            <w:r>
-                              <w:t>(</w:t>
-                            </w:r>
-                            <w:proofErr w:type="spellStart"/>
-                            <w:r>
-                              <w:t>max_length</w:t>
-                            </w:r>
-                            <w:proofErr w:type="spellEnd"/>
-                            <w:r>
-                              <w:t>=20, choices=[('Incomplete', 'Incomplete'), ('In Progress', 'In Progress'), ('Completed', 'Completed')])</w:t>
+                              <w:t xml:space="preserve">    status = models.CharField(max_length=20, choices=[('Incomplete', 'Incomplete'), ('In Progress', 'In Progress'), ('Completed', 'Completed')])</w:t>
                             </w:r>
                           </w:p>
                           <w:p>
                             <w:r>
-                              <w:t xml:space="preserve">    creator = </w:t>
-                            </w:r>
-                            <w:proofErr w:type="spellStart"/>
-                            <w:proofErr w:type="gramStart"/>
-                            <w:r>
-                              <w:t>models.ForeignKey</w:t>
-                            </w:r>
-                            <w:proofErr w:type="spellEnd"/>
-                            <w:proofErr w:type="gramEnd"/>
-                            <w:r>
-                              <w:t xml:space="preserve">(User, </w:t>
-                            </w:r>
-                            <w:proofErr w:type="spellStart"/>
-                            <w:r>
-                              <w:t>on_delete</w:t>
-                            </w:r>
-                            <w:proofErr w:type="spellEnd"/>
-                            <w:r>
-                              <w:t>=</w:t>
-                            </w:r>
-                            <w:proofErr w:type="spellStart"/>
-                            <w:r>
-                              <w:t>models.CASCADE</w:t>
-                            </w:r>
-                            <w:proofErr w:type="spellEnd"/>
-                            <w:r>
-                              <w:t xml:space="preserve">, </w:t>
-                            </w:r>
-                            <w:proofErr w:type="spellStart"/>
-                            <w:r>
-                              <w:t>related_name</w:t>
-                            </w:r>
-                            <w:proofErr w:type="spellEnd"/>
-                            <w:r>
-                              <w:t>='</w:t>
-                            </w:r>
-                            <w:proofErr w:type="spellStart"/>
-                            <w:r>
-                              <w:t>created_tasks</w:t>
-                            </w:r>
-                            <w:proofErr w:type="spellEnd"/>
-                            <w:r>
-                              <w:t>')</w:t>
+                              <w:t xml:space="preserve">    creator = models.ForeignKey(User, on_delete=models.CASCADE, related_name='created_tasks')</w:t>
                             </w:r>
                           </w:p>
                         </w:txbxContent>
@@ -2388,171 +2535,37 @@
                   <w:txbxContent>
                     <w:p>
                       <w:r>
-                        <w:t>class Task(</w:t>
-                      </w:r>
-                      <w:proofErr w:type="spellStart"/>
-                      <w:proofErr w:type="gramStart"/>
-                      <w:r>
-                        <w:t>models.Model</w:t>
-                      </w:r>
-                      <w:proofErr w:type="spellEnd"/>
-                      <w:proofErr w:type="gramEnd"/>
-                      <w:r>
-                        <w:t>):</w:t>
+                        <w:t>class Task(models.Model):</w:t>
                       </w:r>
                     </w:p>
                     <w:p>
                       <w:r>
-                        <w:t xml:space="preserve">    title = </w:t>
-                      </w:r>
-                      <w:proofErr w:type="spellStart"/>
-                      <w:proofErr w:type="gramStart"/>
-                      <w:r>
-                        <w:t>models.CharField</w:t>
-                      </w:r>
-                      <w:proofErr w:type="spellEnd"/>
-                      <w:proofErr w:type="gramEnd"/>
-                      <w:r>
-                        <w:t>(</w:t>
-                      </w:r>
-                      <w:proofErr w:type="spellStart"/>
-                      <w:r>
-                        <w:t>max_length</w:t>
-                      </w:r>
-                      <w:proofErr w:type="spellEnd"/>
-                      <w:r>
-                        <w:t>=250)</w:t>
+                        <w:t xml:space="preserve">    title = models.CharField(max_length=250)</w:t>
                       </w:r>
                     </w:p>
                     <w:p>
                       <w:r>
-                        <w:t xml:space="preserve">    description = </w:t>
-                      </w:r>
-                      <w:proofErr w:type="spellStart"/>
-                      <w:proofErr w:type="gramStart"/>
-                      <w:r>
-                        <w:t>models.TextField</w:t>
-                      </w:r>
-                      <w:proofErr w:type="spellEnd"/>
-                      <w:proofErr w:type="gramEnd"/>
-                      <w:r>
-                        <w:t>()</w:t>
+                        <w:t xml:space="preserve">    description = models.TextField()</w:t>
                       </w:r>
                     </w:p>
                     <w:p>
                       <w:r>
-                        <w:t xml:space="preserve">    </w:t>
-                      </w:r>
-                      <w:proofErr w:type="spellStart"/>
-                      <w:r>
-                        <w:t>due_date</w:t>
-                      </w:r>
-                      <w:proofErr w:type="spellEnd"/>
-                      <w:r>
-                        <w:t xml:space="preserve"> = </w:t>
-                      </w:r>
-                      <w:proofErr w:type="spellStart"/>
-                      <w:proofErr w:type="gramStart"/>
-                      <w:r>
-                        <w:t>models.DateTimeField</w:t>
-                      </w:r>
-                      <w:proofErr w:type="spellEnd"/>
-                      <w:proofErr w:type="gramEnd"/>
-                      <w:r>
-                        <w:t>()</w:t>
+                        <w:t xml:space="preserve">    due_date = models.DateTimeField()</w:t>
                       </w:r>
                     </w:p>
                     <w:p>
                       <w:r>
-                        <w:t xml:space="preserve">    priority = </w:t>
-                      </w:r>
-                      <w:proofErr w:type="spellStart"/>
-                      <w:proofErr w:type="gramStart"/>
-                      <w:r>
-                        <w:t>models.CharField</w:t>
-                      </w:r>
-                      <w:proofErr w:type="spellEnd"/>
-                      <w:proofErr w:type="gramEnd"/>
-                      <w:r>
-                        <w:t>(</w:t>
-                      </w:r>
-                      <w:proofErr w:type="spellStart"/>
-                      <w:r>
-                        <w:t>max_length</w:t>
-                      </w:r>
-                      <w:proofErr w:type="spellEnd"/>
-                      <w:r>
-                        <w:t>=10, choices=[('High', 'High'), ('Medium', 'Medium'), ('Low', 'Low')])</w:t>
+                        <w:t xml:space="preserve">    priority = models.CharField(max_length=10, choices=[('High', 'High'), ('Medium', 'Medium'), ('Low', 'Low')])</w:t>
                       </w:r>
                     </w:p>
                     <w:p>
                       <w:r>
-                        <w:t xml:space="preserve">    status = </w:t>
-                      </w:r>
-                      <w:proofErr w:type="spellStart"/>
-                      <w:proofErr w:type="gramStart"/>
-                      <w:r>
-                        <w:t>models.CharField</w:t>
-                      </w:r>
-                      <w:proofErr w:type="spellEnd"/>
-                      <w:proofErr w:type="gramEnd"/>
-                      <w:r>
-                        <w:t>(</w:t>
-                      </w:r>
-                      <w:proofErr w:type="spellStart"/>
-                      <w:r>
-                        <w:t>max_length</w:t>
-                      </w:r>
-                      <w:proofErr w:type="spellEnd"/>
-                      <w:r>
-                        <w:t>=20, choices=[('Incomplete', 'Incomplete'), ('In Progress', 'In Progress'), ('Completed', 'Completed')])</w:t>
+                        <w:t xml:space="preserve">    status = models.CharField(max_length=20, choices=[('Incomplete', 'Incomplete'), ('In Progress', 'In Progress'), ('Completed', 'Completed')])</w:t>
                       </w:r>
                     </w:p>
                     <w:p>
                       <w:r>
-                        <w:t xml:space="preserve">    creator = </w:t>
-                      </w:r>
-                      <w:proofErr w:type="spellStart"/>
-                      <w:proofErr w:type="gramStart"/>
-                      <w:r>
-                        <w:t>models.ForeignKey</w:t>
-                      </w:r>
-                      <w:proofErr w:type="spellEnd"/>
-                      <w:proofErr w:type="gramEnd"/>
-                      <w:r>
-                        <w:t xml:space="preserve">(User, </w:t>
-                      </w:r>
-                      <w:proofErr w:type="spellStart"/>
-                      <w:r>
-                        <w:t>on_delete</w:t>
-                      </w:r>
-                      <w:proofErr w:type="spellEnd"/>
-                      <w:r>
-                        <w:t>=</w:t>
-                      </w:r>
-                      <w:proofErr w:type="spellStart"/>
-                      <w:r>
-                        <w:t>models.CASCADE</w:t>
-                      </w:r>
-                      <w:proofErr w:type="spellEnd"/>
-                      <w:r>
-                        <w:t xml:space="preserve">, </w:t>
-                      </w:r>
-                      <w:proofErr w:type="spellStart"/>
-                      <w:r>
-                        <w:t>related_name</w:t>
-                      </w:r>
-                      <w:proofErr w:type="spellEnd"/>
-                      <w:r>
-                        <w:t>='</w:t>
-                      </w:r>
-                      <w:proofErr w:type="spellStart"/>
-                      <w:r>
-                        <w:t>created_tasks</w:t>
-                      </w:r>
-                      <w:proofErr w:type="spellEnd"/>
-                      <w:r>
-                        <w:t>')</w:t>
+                        <w:t xml:space="preserve">    creator = models.ForeignKey(User, on_delete=models.CASCADE, related_name='created_tasks')</w:t>
                       </w:r>
                     </w:p>
                   </w:txbxContent>
@@ -2722,87 +2735,17 @@
                         <w:txbxContent>
                           <w:p>
                             <w:r>
-                              <w:t>class Assignment(</w:t>
-                            </w:r>
-                            <w:proofErr w:type="spellStart"/>
-                            <w:proofErr w:type="gramStart"/>
-                            <w:r>
-                              <w:t>models.Model</w:t>
-                            </w:r>
-                            <w:proofErr w:type="spellEnd"/>
-                            <w:proofErr w:type="gramEnd"/>
-                            <w:r>
-                              <w:t>):</w:t>
+                              <w:t>class Assignment(models.Model):</w:t>
                             </w:r>
                           </w:p>
                           <w:p>
                             <w:r>
-                              <w:t xml:space="preserve">    task = </w:t>
-                            </w:r>
-                            <w:proofErr w:type="spellStart"/>
-                            <w:proofErr w:type="gramStart"/>
-                            <w:r>
-                              <w:t>models.ForeignKey</w:t>
-                            </w:r>
-                            <w:proofErr w:type="spellEnd"/>
-                            <w:proofErr w:type="gramEnd"/>
-                            <w:r>
-                              <w:t xml:space="preserve">(Task, </w:t>
-                            </w:r>
-                            <w:proofErr w:type="spellStart"/>
-                            <w:r>
-                              <w:t>on_delete</w:t>
-                            </w:r>
-                            <w:proofErr w:type="spellEnd"/>
-                            <w:r>
-                              <w:t>=</w:t>
-                            </w:r>
-                            <w:proofErr w:type="spellStart"/>
-                            <w:r>
-                              <w:t>models.CASCADE</w:t>
-                            </w:r>
-                            <w:proofErr w:type="spellEnd"/>
-                            <w:r>
-                              <w:t>)</w:t>
+                              <w:t xml:space="preserve">    task = models.ForeignKey(Task, on_delete=models.CASCADE)</w:t>
                             </w:r>
                           </w:p>
                           <w:p>
                             <w:r>
-                              <w:t xml:space="preserve">    </w:t>
-                            </w:r>
-                            <w:proofErr w:type="spellStart"/>
-                            <w:r>
-                              <w:t>assigned_user</w:t>
-                            </w:r>
-                            <w:proofErr w:type="spellEnd"/>
-                            <w:r>
-                              <w:t xml:space="preserve"> = </w:t>
-                            </w:r>
-                            <w:proofErr w:type="spellStart"/>
-                            <w:proofErr w:type="gramStart"/>
-                            <w:r>
-                              <w:t>models.ForeignKey</w:t>
-                            </w:r>
-                            <w:proofErr w:type="spellEnd"/>
-                            <w:proofErr w:type="gramEnd"/>
-                            <w:r>
-                              <w:t xml:space="preserve">(User, </w:t>
-                            </w:r>
-                            <w:proofErr w:type="spellStart"/>
-                            <w:r>
-                              <w:t>on_delete</w:t>
-                            </w:r>
-                            <w:proofErr w:type="spellEnd"/>
-                            <w:r>
-                              <w:t>=</w:t>
-                            </w:r>
-                            <w:proofErr w:type="spellStart"/>
-                            <w:r>
-                              <w:t>models.CASCADE</w:t>
-                            </w:r>
-                            <w:proofErr w:type="spellEnd"/>
-                            <w:r>
-                              <w:t>)</w:t>
+                              <w:t xml:space="preserve">    assigned_user = models.ForeignKey(User, on_delete=models.CASCADE)</w:t>
                             </w:r>
                           </w:p>
                         </w:txbxContent>
@@ -2829,87 +2772,17 @@
                   <w:txbxContent>
                     <w:p>
                       <w:r>
-                        <w:t>class Assignment(</w:t>
-                      </w:r>
-                      <w:proofErr w:type="spellStart"/>
-                      <w:proofErr w:type="gramStart"/>
-                      <w:r>
-                        <w:t>models.Model</w:t>
-                      </w:r>
-                      <w:proofErr w:type="spellEnd"/>
-                      <w:proofErr w:type="gramEnd"/>
-                      <w:r>
-                        <w:t>):</w:t>
+                        <w:t>class Assignment(models.Model):</w:t>
                       </w:r>
                     </w:p>
                     <w:p>
                       <w:r>
-                        <w:t xml:space="preserve">    task = </w:t>
-                      </w:r>
-                      <w:proofErr w:type="spellStart"/>
-                      <w:proofErr w:type="gramStart"/>
-                      <w:r>
-                        <w:t>models.ForeignKey</w:t>
-                      </w:r>
-                      <w:proofErr w:type="spellEnd"/>
-                      <w:proofErr w:type="gramEnd"/>
-                      <w:r>
-                        <w:t xml:space="preserve">(Task, </w:t>
-                      </w:r>
-                      <w:proofErr w:type="spellStart"/>
-                      <w:r>
-                        <w:t>on_delete</w:t>
-                      </w:r>
-                      <w:proofErr w:type="spellEnd"/>
-                      <w:r>
-                        <w:t>=</w:t>
-                      </w:r>
-                      <w:proofErr w:type="spellStart"/>
-                      <w:r>
-                        <w:t>models.CASCADE</w:t>
-                      </w:r>
-                      <w:proofErr w:type="spellEnd"/>
-                      <w:r>
-                        <w:t>)</w:t>
+                        <w:t xml:space="preserve">    task = models.ForeignKey(Task, on_delete=models.CASCADE)</w:t>
                       </w:r>
                     </w:p>
                     <w:p>
                       <w:r>
-                        <w:t xml:space="preserve">    </w:t>
-                      </w:r>
-                      <w:proofErr w:type="spellStart"/>
-                      <w:r>
-                        <w:t>assigned_user</w:t>
-                      </w:r>
-                      <w:proofErr w:type="spellEnd"/>
-                      <w:r>
-                        <w:t xml:space="preserve"> = </w:t>
-                      </w:r>
-                      <w:proofErr w:type="spellStart"/>
-                      <w:proofErr w:type="gramStart"/>
-                      <w:r>
-                        <w:t>models.ForeignKey</w:t>
-                      </w:r>
-                      <w:proofErr w:type="spellEnd"/>
-                      <w:proofErr w:type="gramEnd"/>
-                      <w:r>
-                        <w:t xml:space="preserve">(User, </w:t>
-                      </w:r>
-                      <w:proofErr w:type="spellStart"/>
-                      <w:r>
-                        <w:t>on_delete</w:t>
-                      </w:r>
-                      <w:proofErr w:type="spellEnd"/>
-                      <w:r>
-                        <w:t>=</w:t>
-                      </w:r>
-                      <w:proofErr w:type="spellStart"/>
-                      <w:r>
-                        <w:t>models.CASCADE</w:t>
-                      </w:r>
-                      <w:proofErr w:type="spellEnd"/>
-                      <w:r>
-                        <w:t>)</w:t>
+                        <w:t xml:space="preserve">    assigned_user = models.ForeignKey(User, on_delete=models.CASCADE)</w:t>
                       </w:r>
                     </w:p>
                   </w:txbxContent>
@@ -3006,6 +2879,9 @@
     </w:p>
     <w:p>
       <w:r>
+        <w:rPr>
+          <w:noProof/>
+        </w:rPr>
         <w:lastRenderedPageBreak/>
         <w:drawing>
           <wp:inline distT="0" distB="0" distL="0" distR="0" wp14:anchorId="32E73DDA" wp14:editId="6306BA3F">
@@ -3050,8 +2926,13 @@
         <w:pStyle w:val="Heading1"/>
       </w:pPr>
       <w:r>
-        <w:t xml:space="preserve"> API Design</w:t>
-      </w:r>
+        <w:t xml:space="preserve"> </w:t>
+      </w:r>
+      <w:bookmarkStart w:id="3" w:name="_Toc179977632"/>
+      <w:r>
+        <w:t>API Design</w:t>
+      </w:r>
+      <w:bookmarkEnd w:id="3"/>
     </w:p>
     <w:p>
       <w:r>
@@ -3174,9 +3055,11 @@
       <w:pPr>
         <w:pStyle w:val="Heading1"/>
       </w:pPr>
+      <w:bookmarkStart w:id="4" w:name="_Toc179977633"/>
       <w:r>
         <w:t>User Interface UI design</w:t>
       </w:r>
+      <w:bookmarkEnd w:id="4"/>
     </w:p>
     <w:p>
       <w:r>
@@ -3206,6 +3089,9 @@
         <w:ind w:left="720"/>
       </w:pPr>
       <w:r>
+        <w:rPr>
+          <w:noProof/>
+        </w:rPr>
         <w:drawing>
           <wp:inline distT="0" distB="0" distL="0" distR="0" wp14:anchorId="3AB0AA0E" wp14:editId="00D5AD5C">
             <wp:extent cx="3105583" cy="2267266"/>
@@ -3266,6 +3152,9 @@
         <w:ind w:left="720"/>
       </w:pPr>
       <w:r>
+        <w:rPr>
+          <w:noProof/>
+        </w:rPr>
         <w:lastRenderedPageBreak/>
         <w:drawing>
           <wp:inline distT="0" distB="0" distL="0" distR="0" wp14:anchorId="07D687B3" wp14:editId="59DB4598">
@@ -3327,6 +3216,9 @@
         <w:ind w:left="720"/>
       </w:pPr>
       <w:r>
+        <w:rPr>
+          <w:noProof/>
+        </w:rPr>
         <w:lastRenderedPageBreak/>
         <w:drawing>
           <wp:inline distT="0" distB="0" distL="0" distR="0" wp14:anchorId="795C93D2" wp14:editId="64E8C41A">
@@ -3385,6 +3277,9 @@
     </w:p>
     <w:p>
       <w:r>
+        <w:rPr>
+          <w:noProof/>
+        </w:rPr>
         <w:lastRenderedPageBreak/>
         <w:drawing>
           <wp:inline distT="0" distB="0" distL="0" distR="0" wp14:anchorId="70F0A603" wp14:editId="1CDB4B09">
@@ -3428,9 +3323,11 @@
       <w:pPr>
         <w:pStyle w:val="Heading1"/>
       </w:pPr>
+      <w:bookmarkStart w:id="5" w:name="_Toc179977634"/>
       <w:r>
         <w:t>Security Considerations</w:t>
       </w:r>
+      <w:bookmarkEnd w:id="5"/>
     </w:p>
     <w:p>
       <w:pPr>
@@ -3509,8 +3406,13 @@
       <w:pPr>
         <w:pStyle w:val="Heading1"/>
       </w:pPr>
-      <w:r>
-        <w:t xml:space="preserve">Error Handling </w:t>
+      <w:bookmarkStart w:id="6" w:name="_Toc179977635"/>
+      <w:r>
+        <w:t>Error Handling</w:t>
+      </w:r>
+      <w:bookmarkEnd w:id="6"/>
+      <w:r>
+        <w:t xml:space="preserve"> </w:t>
       </w:r>
     </w:p>
     <w:p>
@@ -3580,8 +3482,13 @@
       <w:pPr>
         <w:pStyle w:val="Heading1"/>
       </w:pPr>
-      <w:r>
-        <w:t xml:space="preserve">Testing Strategy </w:t>
+      <w:bookmarkStart w:id="7" w:name="_Toc179977636"/>
+      <w:r>
+        <w:t>Testing Strategy</w:t>
+      </w:r>
+      <w:bookmarkEnd w:id="7"/>
+      <w:r>
+        <w:t xml:space="preserve"> </w:t>
       </w:r>
     </w:p>
     <w:p>
@@ -8193,6 +8100,7 @@
   <w:style w:type="character" w:default="1" w:styleId="DefaultParagraphFont">
     <w:name w:val="Default Paragraph Font"/>
     <w:uiPriority w:val="1"/>
+    <w:semiHidden/>
     <w:unhideWhenUsed/>
   </w:style>
   <w:style w:type="table" w:default="1" w:styleId="TableNormal">

</xml_diff>